<commit_message>
fix draw spec and uot doc
</commit_message>
<xml_diff>
--- a/public/templates/TemplateQuotation.docx
+++ b/public/templates/TemplateQuotation.docx
@@ -103,54 +103,23 @@
         </w:rPr>
         <w:t>i</w:t>
       </w:r>
-      <w:proofErr w:type="spellStart"/>
-      <w:r>
-        <w:rPr>
-          <w:rFonts w:ascii="Century Gothic" w:hAnsi="Century Gothic" w:cs="Century Gothic"/>
-          <w:b/>
-          <w:sz w:val="18"/>
-          <w:szCs w:val="16"/>
-        </w:rPr>
-        <w:t>kande</w:t>
-      </w:r>
-      <w:proofErr w:type="spellEnd"/>
-      <w:r>
-        <w:rPr>
-          <w:rFonts w:ascii="Century Gothic" w:hAnsi="Century Gothic" w:cs="Century Gothic"/>
-          <w:b/>
-          <w:sz w:val="18"/>
-          <w:szCs w:val="16"/>
-        </w:rPr>
-        <w:t xml:space="preserve">, </w:t>
-      </w:r>
-      <w:r>
-        <w:rPr>
-          <w:rFonts w:ascii="Century Gothic" w:hAnsi="Century Gothic" w:cs="Century Gothic"/>
-          <w:b/>
-          <w:sz w:val="18"/>
-          <w:szCs w:val="16"/>
-        </w:rPr>
-        <w:t>{</w:t>
-      </w:r>
-      <w:proofErr w:type="spellStart"/>
-      <w:r>
-        <w:rPr>
-          <w:rFonts w:ascii="Century Gothic" w:hAnsi="Century Gothic" w:cs="Century Gothic"/>
-          <w:b/>
-          <w:sz w:val="18"/>
-          <w:szCs w:val="16"/>
-        </w:rPr>
-        <w:t>quotation_date</w:t>
-      </w:r>
-      <w:proofErr w:type="spellEnd"/>
-      <w:r>
-        <w:rPr>
-          <w:rFonts w:ascii="Century Gothic" w:hAnsi="Century Gothic" w:cs="Century Gothic"/>
-          <w:b/>
-          <w:sz w:val="18"/>
-          <w:szCs w:val="16"/>
-        </w:rPr>
-        <w:t>}</w:t>
+      <w:r>
+        <w:rPr>
+          <w:rFonts w:ascii="Century Gothic" w:hAnsi="Century Gothic" w:cs="Century Gothic"/>
+          <w:b/>
+          <w:sz w:val="18"/>
+          <w:szCs w:val="16"/>
+        </w:rPr>
+        <w:t xml:space="preserve">kande, </w:t>
+      </w:r>
+      <w:r>
+        <w:rPr>
+          <w:rFonts w:ascii="Century Gothic" w:hAnsi="Century Gothic" w:cs="Century Gothic"/>
+          <w:b/>
+          <w:sz w:val="18"/>
+          <w:szCs w:val="16"/>
+        </w:rPr>
+        <w:t>{quotation_date}</w:t>
       </w:r>
     </w:p>
     <w:p>
@@ -191,29 +160,7 @@
           <w:szCs w:val="18"/>
           <w:u w:val="single"/>
         </w:rPr>
-        <w:t>{</w:t>
-      </w:r>
-      <w:proofErr w:type="spellStart"/>
-      <w:r>
-        <w:rPr>
-          <w:rFonts w:ascii="Century Gothic" w:hAnsi="Century Gothic" w:cs="Century Gothic"/>
-          <w:b/>
-          <w:sz w:val="18"/>
-          <w:szCs w:val="18"/>
-          <w:u w:val="single"/>
-        </w:rPr>
-        <w:t>quotation_number</w:t>
-      </w:r>
-      <w:proofErr w:type="spellEnd"/>
-      <w:r>
-        <w:rPr>
-          <w:rFonts w:ascii="Century Gothic" w:hAnsi="Century Gothic" w:cs="Century Gothic"/>
-          <w:b/>
-          <w:sz w:val="18"/>
-          <w:szCs w:val="18"/>
-          <w:u w:val="single"/>
-        </w:rPr>
-        <w:t>}</w:t>
+        <w:t>{quotation_number}</w:t>
       </w:r>
     </w:p>
     <w:p>
@@ -261,49 +208,15 @@
         </w:rPr>
         <w:t xml:space="preserve">  </w:t>
       </w:r>
-      <w:proofErr w:type="spellStart"/>
-      <w:r>
-        <w:rPr>
-          <w:rFonts w:ascii="Century Gothic" w:hAnsi="Century Gothic" w:cs="Tahoma"/>
-          <w:b/>
-          <w:color w:val="000000"/>
-          <w:sz w:val="18"/>
-          <w:szCs w:val="16"/>
-        </w:rPr>
-        <w:t>Kepada</w:t>
-      </w:r>
-      <w:proofErr w:type="spellEnd"/>
-      <w:r>
-        <w:rPr>
-          <w:rFonts w:ascii="Century Gothic" w:hAnsi="Century Gothic" w:cs="Tahoma"/>
-          <w:b/>
-          <w:color w:val="000000"/>
-          <w:sz w:val="18"/>
-          <w:szCs w:val="16"/>
-        </w:rPr>
-        <w:t xml:space="preserve"> </w:t>
-      </w:r>
-      <w:proofErr w:type="spellStart"/>
-      <w:r>
-        <w:rPr>
-          <w:rFonts w:ascii="Century Gothic" w:hAnsi="Century Gothic" w:cs="Tahoma"/>
-          <w:b/>
-          <w:color w:val="000000"/>
-          <w:sz w:val="18"/>
-          <w:szCs w:val="16"/>
-        </w:rPr>
-        <w:t>Yth</w:t>
-      </w:r>
-      <w:proofErr w:type="spellEnd"/>
-      <w:r>
-        <w:rPr>
-          <w:rFonts w:ascii="Century Gothic" w:hAnsi="Century Gothic" w:cs="Tahoma"/>
-          <w:b/>
-          <w:color w:val="000000"/>
-          <w:sz w:val="18"/>
-          <w:szCs w:val="16"/>
-        </w:rPr>
-        <w:t>.</w:t>
+      <w:r>
+        <w:rPr>
+          <w:rFonts w:ascii="Century Gothic" w:hAnsi="Century Gothic" w:cs="Tahoma"/>
+          <w:b/>
+          <w:color w:val="000000"/>
+          <w:sz w:val="18"/>
+          <w:szCs w:val="16"/>
+        </w:rPr>
+        <w:t>Kepada Yth.</w:t>
       </w:r>
     </w:p>
     <w:p>
@@ -331,27 +244,7 @@
           <w:sz w:val="18"/>
           <w:szCs w:val="16"/>
         </w:rPr>
-        <w:t>{</w:t>
-      </w:r>
-      <w:proofErr w:type="spellStart"/>
-      <w:r>
-        <w:rPr>
-          <w:rFonts w:ascii="Century Gothic" w:hAnsi="Century Gothic" w:cs="Century Gothic"/>
-          <w:b/>
-          <w:sz w:val="18"/>
-          <w:szCs w:val="16"/>
-        </w:rPr>
-        <w:t>customer_name</w:t>
-      </w:r>
-      <w:proofErr w:type="spellEnd"/>
-      <w:r>
-        <w:rPr>
-          <w:rFonts w:ascii="Century Gothic" w:hAnsi="Century Gothic" w:cs="Century Gothic"/>
-          <w:b/>
-          <w:sz w:val="18"/>
-          <w:szCs w:val="16"/>
-        </w:rPr>
-        <w:t>}</w:t>
+        <w:t>{customer_name}</w:t>
       </w:r>
     </w:p>
     <w:p>
@@ -379,47 +272,7 @@
           <w:sz w:val="18"/>
           <w:szCs w:val="16"/>
         </w:rPr>
-        <w:t>{</w:t>
-      </w:r>
-      <w:proofErr w:type="spellStart"/>
-      <w:r>
-        <w:rPr>
-          <w:rFonts w:ascii="Century Gothic" w:hAnsi="Century Gothic" w:cs="Century Gothic"/>
-          <w:b/>
-          <w:sz w:val="18"/>
-          <w:szCs w:val="16"/>
-        </w:rPr>
-        <w:t>contact_gender</w:t>
-      </w:r>
-      <w:proofErr w:type="spellEnd"/>
-      <w:r>
-        <w:rPr>
-          <w:rFonts w:ascii="Century Gothic" w:hAnsi="Century Gothic" w:cs="Century Gothic"/>
-          <w:b/>
-          <w:sz w:val="18"/>
-          <w:szCs w:val="16"/>
-        </w:rPr>
-        <w:t>} {</w:t>
-      </w:r>
-      <w:proofErr w:type="spellStart"/>
-      <w:r>
-        <w:rPr>
-          <w:rFonts w:ascii="Century Gothic" w:hAnsi="Century Gothic" w:cs="Century Gothic"/>
-          <w:b/>
-          <w:sz w:val="18"/>
-          <w:szCs w:val="16"/>
-        </w:rPr>
-        <w:t>contact_person</w:t>
-      </w:r>
-      <w:proofErr w:type="spellEnd"/>
-      <w:r>
-        <w:rPr>
-          <w:rFonts w:ascii="Century Gothic" w:hAnsi="Century Gothic" w:cs="Century Gothic"/>
-          <w:b/>
-          <w:sz w:val="18"/>
-          <w:szCs w:val="16"/>
-        </w:rPr>
-        <w:t>}</w:t>
+        <w:t>{contact_gender} {contact_person}</w:t>
       </w:r>
     </w:p>
     <w:p>
@@ -440,20 +293,8 @@
           <w:sz w:val="18"/>
           <w:szCs w:val="16"/>
         </w:rPr>
-        <w:t xml:space="preserve">Di </w:t>
-      </w:r>
-      <w:proofErr w:type="spellStart"/>
-      <w:r>
-        <w:rPr>
-          <w:rFonts w:ascii="Century Gothic" w:hAnsi="Century Gothic" w:cs="Tahoma"/>
-          <w:b/>
-          <w:color w:val="000000"/>
-          <w:sz w:val="18"/>
-          <w:szCs w:val="16"/>
-        </w:rPr>
-        <w:t>tempat</w:t>
-      </w:r>
-      <w:proofErr w:type="spellEnd"/>
+        <w:t>Di tempat</w:t>
+      </w:r>
       <w:r>
         <w:rPr>
           <w:rFonts w:ascii="Century Gothic" w:hAnsi="Century Gothic" w:cs="Century Gothic"/>
@@ -509,25 +350,14 @@
           <w:szCs w:val="18"/>
         </w:rPr>
       </w:pPr>
-      <w:proofErr w:type="spellStart"/>
-      <w:r>
-        <w:rPr>
-          <w:rFonts w:ascii="Century Gothic" w:hAnsi="Century Gothic" w:cs="Century Gothic"/>
-          <w:color w:val="000000"/>
-          <w:sz w:val="18"/>
-          <w:szCs w:val="18"/>
-        </w:rPr>
-        <w:t>Dengan</w:t>
-      </w:r>
-      <w:proofErr w:type="spellEnd"/>
-      <w:r>
-        <w:rPr>
-          <w:rFonts w:ascii="Century Gothic" w:hAnsi="Century Gothic" w:cs="Century Gothic"/>
-          <w:color w:val="000000"/>
-          <w:sz w:val="18"/>
-          <w:szCs w:val="18"/>
-        </w:rPr>
-        <w:t xml:space="preserve"> Hormat, </w:t>
+      <w:r>
+        <w:rPr>
+          <w:rFonts w:ascii="Century Gothic" w:hAnsi="Century Gothic" w:cs="Century Gothic"/>
+          <w:color w:val="000000"/>
+          <w:sz w:val="18"/>
+          <w:szCs w:val="18"/>
+        </w:rPr>
+        <w:t xml:space="preserve">Dengan Hormat, </w:t>
       </w:r>
     </w:p>
     <w:p>
@@ -560,27 +390,7 @@
           <w:sz w:val="18"/>
           <w:szCs w:val="18"/>
         </w:rPr>
-        <w:t xml:space="preserve">Bersama </w:t>
-      </w:r>
-      <w:proofErr w:type="spellStart"/>
-      <w:r>
-        <w:rPr>
-          <w:rFonts w:ascii="Century Gothic" w:hAnsi="Century Gothic" w:cs="Tahoma"/>
-          <w:color w:val="000000"/>
-          <w:sz w:val="18"/>
-          <w:szCs w:val="18"/>
-        </w:rPr>
-        <w:t>ini</w:t>
-      </w:r>
-      <w:proofErr w:type="spellEnd"/>
-      <w:r>
-        <w:rPr>
-          <w:rFonts w:ascii="Century Gothic" w:hAnsi="Century Gothic" w:cs="Tahoma"/>
-          <w:color w:val="000000"/>
-          <w:sz w:val="18"/>
-          <w:szCs w:val="18"/>
-        </w:rPr>
-        <w:t xml:space="preserve"> kami </w:t>
+        <w:t xml:space="preserve">Bersama ini kami </w:t>
       </w:r>
       <w:r>
         <w:rPr>
@@ -599,207 +409,7 @@
           <w:sz w:val="18"/>
           <w:szCs w:val="18"/>
         </w:rPr>
-        <w:t xml:space="preserve"> </w:t>
-      </w:r>
-      <w:proofErr w:type="spellStart"/>
-      <w:r>
-        <w:rPr>
-          <w:rFonts w:ascii="Century Gothic" w:hAnsi="Century Gothic" w:cs="Tahoma"/>
-          <w:color w:val="000000"/>
-          <w:sz w:val="18"/>
-          <w:szCs w:val="18"/>
-        </w:rPr>
-        <w:t>bermaksud</w:t>
-      </w:r>
-      <w:proofErr w:type="spellEnd"/>
-      <w:r>
-        <w:rPr>
-          <w:rFonts w:ascii="Century Gothic" w:hAnsi="Century Gothic" w:cs="Tahoma"/>
-          <w:color w:val="000000"/>
-          <w:sz w:val="18"/>
-          <w:szCs w:val="18"/>
-        </w:rPr>
-        <w:t xml:space="preserve"> </w:t>
-      </w:r>
-      <w:proofErr w:type="spellStart"/>
-      <w:r>
-        <w:rPr>
-          <w:rFonts w:ascii="Century Gothic" w:hAnsi="Century Gothic" w:cs="Tahoma"/>
-          <w:color w:val="000000"/>
-          <w:sz w:val="18"/>
-          <w:szCs w:val="18"/>
-        </w:rPr>
-        <w:t>untuk</w:t>
-      </w:r>
-      <w:proofErr w:type="spellEnd"/>
-      <w:r>
-        <w:rPr>
-          <w:rFonts w:ascii="Century Gothic" w:hAnsi="Century Gothic" w:cs="Tahoma"/>
-          <w:color w:val="000000"/>
-          <w:sz w:val="18"/>
-          <w:szCs w:val="18"/>
-        </w:rPr>
-        <w:t xml:space="preserve"> </w:t>
-      </w:r>
-      <w:proofErr w:type="spellStart"/>
-      <w:r>
-        <w:rPr>
-          <w:rFonts w:ascii="Century Gothic" w:hAnsi="Century Gothic" w:cs="Tahoma"/>
-          <w:color w:val="000000"/>
-          <w:sz w:val="18"/>
-          <w:szCs w:val="18"/>
-        </w:rPr>
-        <w:t>mengajukan</w:t>
-      </w:r>
-      <w:proofErr w:type="spellEnd"/>
-      <w:r>
-        <w:rPr>
-          <w:rFonts w:ascii="Century Gothic" w:hAnsi="Century Gothic" w:cs="Tahoma"/>
-          <w:color w:val="000000"/>
-          <w:sz w:val="18"/>
-          <w:szCs w:val="18"/>
-        </w:rPr>
-        <w:t xml:space="preserve"> </w:t>
-      </w:r>
-      <w:proofErr w:type="spellStart"/>
-      <w:r>
-        <w:rPr>
-          <w:rFonts w:ascii="Century Gothic" w:hAnsi="Century Gothic" w:cs="Tahoma"/>
-          <w:color w:val="000000"/>
-          <w:sz w:val="18"/>
-          <w:szCs w:val="18"/>
-        </w:rPr>
-        <w:t>penawaran</w:t>
-      </w:r>
-      <w:proofErr w:type="spellEnd"/>
-      <w:r>
-        <w:rPr>
-          <w:rFonts w:ascii="Century Gothic" w:hAnsi="Century Gothic" w:cs="Tahoma"/>
-          <w:color w:val="000000"/>
-          <w:sz w:val="18"/>
-          <w:szCs w:val="18"/>
-        </w:rPr>
-        <w:t xml:space="preserve"> </w:t>
-      </w:r>
-      <w:proofErr w:type="spellStart"/>
-      <w:r>
-        <w:rPr>
-          <w:rFonts w:ascii="Century Gothic" w:hAnsi="Century Gothic" w:cs="Tahoma"/>
-          <w:color w:val="000000"/>
-          <w:sz w:val="18"/>
-          <w:szCs w:val="18"/>
-        </w:rPr>
-        <w:t>harga</w:t>
-      </w:r>
-      <w:proofErr w:type="spellEnd"/>
-      <w:r>
-        <w:rPr>
-          <w:rFonts w:ascii="Century Gothic" w:hAnsi="Century Gothic" w:cs="Tahoma"/>
-          <w:color w:val="000000"/>
-          <w:sz w:val="18"/>
-          <w:szCs w:val="18"/>
-        </w:rPr>
-        <w:t xml:space="preserve"> </w:t>
-      </w:r>
-      <w:proofErr w:type="spellStart"/>
-      <w:r>
-        <w:rPr>
-          <w:rFonts w:ascii="Century Gothic" w:hAnsi="Century Gothic" w:cs="Tahoma"/>
-          <w:color w:val="000000"/>
-          <w:sz w:val="18"/>
-          <w:szCs w:val="18"/>
-        </w:rPr>
-        <w:t>pembuatan</w:t>
-      </w:r>
-      <w:proofErr w:type="spellEnd"/>
-      <w:r>
-        <w:rPr>
-          <w:rFonts w:ascii="Century Gothic" w:hAnsi="Century Gothic" w:cs="Tahoma"/>
-          <w:color w:val="000000"/>
-          <w:sz w:val="18"/>
-          <w:szCs w:val="18"/>
-        </w:rPr>
-        <w:t xml:space="preserve"> </w:t>
-      </w:r>
-      <w:proofErr w:type="spellStart"/>
-      <w:r>
-        <w:rPr>
-          <w:rFonts w:ascii="Century Gothic" w:hAnsi="Century Gothic" w:cs="Tahoma"/>
-          <w:color w:val="000000"/>
-          <w:sz w:val="18"/>
-          <w:szCs w:val="18"/>
-        </w:rPr>
-        <w:t>Karoseri</w:t>
-      </w:r>
-      <w:proofErr w:type="spellEnd"/>
-      <w:r>
-        <w:rPr>
-          <w:rFonts w:ascii="Century Gothic" w:hAnsi="Century Gothic" w:cs="Tahoma"/>
-          <w:color w:val="000000"/>
-          <w:sz w:val="18"/>
-          <w:szCs w:val="18"/>
-        </w:rPr>
-        <w:t xml:space="preserve"> </w:t>
-      </w:r>
-      <w:proofErr w:type="spellStart"/>
-      <w:r>
-        <w:rPr>
-          <w:rFonts w:ascii="Century Gothic" w:hAnsi="Century Gothic" w:cs="Tahoma"/>
-          <w:color w:val="000000"/>
-          <w:sz w:val="18"/>
-          <w:szCs w:val="18"/>
-        </w:rPr>
-        <w:t>dengan</w:t>
-      </w:r>
-      <w:proofErr w:type="spellEnd"/>
-      <w:r>
-        <w:rPr>
-          <w:rFonts w:ascii="Century Gothic" w:hAnsi="Century Gothic" w:cs="Tahoma"/>
-          <w:color w:val="000000"/>
-          <w:sz w:val="18"/>
-          <w:szCs w:val="18"/>
-        </w:rPr>
-        <w:t xml:space="preserve"> data </w:t>
-      </w:r>
-      <w:proofErr w:type="spellStart"/>
-      <w:r>
-        <w:rPr>
-          <w:rFonts w:ascii="Century Gothic" w:hAnsi="Century Gothic" w:cs="Tahoma"/>
-          <w:color w:val="000000"/>
-          <w:sz w:val="18"/>
-          <w:szCs w:val="18"/>
-        </w:rPr>
-        <w:t>sebagai</w:t>
-      </w:r>
-      <w:proofErr w:type="spellEnd"/>
-      <w:r>
-        <w:rPr>
-          <w:rFonts w:ascii="Century Gothic" w:hAnsi="Century Gothic" w:cs="Tahoma"/>
-          <w:color w:val="000000"/>
-          <w:sz w:val="18"/>
-          <w:szCs w:val="18"/>
-        </w:rPr>
-        <w:t xml:space="preserve"> </w:t>
-      </w:r>
-      <w:proofErr w:type="spellStart"/>
-      <w:r>
-        <w:rPr>
-          <w:rFonts w:ascii="Century Gothic" w:hAnsi="Century Gothic" w:cs="Tahoma"/>
-          <w:color w:val="000000"/>
-          <w:sz w:val="18"/>
-          <w:szCs w:val="18"/>
-        </w:rPr>
-        <w:t>berikut</w:t>
-      </w:r>
-      <w:proofErr w:type="spellEnd"/>
-      <w:r>
-        <w:rPr>
-          <w:rFonts w:ascii="Century Gothic" w:hAnsi="Century Gothic" w:cs="Tahoma"/>
-          <w:color w:val="000000"/>
-          <w:sz w:val="18"/>
-          <w:szCs w:val="18"/>
-        </w:rPr>
-        <w:t xml:space="preserve"> :</w:t>
+        <w:t xml:space="preserve"> bermaksud untuk mengajukan penawaran harga pembuatan Karoseri dengan data sebagai berikut :</w:t>
       </w:r>
     </w:p>
     <w:p>
@@ -854,6 +464,30 @@
       <w:pPr>
         <w:pStyle w:val="ListParagraph"/>
         <w:spacing w:line="276" w:lineRule="auto"/>
+        <w:ind w:left="0" w:firstLine="720"/>
+        <w:rPr>
+          <w:rFonts w:ascii="Consolas" w:hAnsi="Consolas" w:cs="Courier New"/>
+          <w:b/>
+          <w:bCs/>
+          <w:sz w:val="16"/>
+          <w:szCs w:val="16"/>
+        </w:rPr>
+      </w:pPr>
+      <w:r>
+        <w:rPr>
+          <w:rFonts w:ascii="Consolas" w:hAnsi="Consolas" w:cs="Courier New"/>
+          <w:b/>
+          <w:bCs/>
+          <w:sz w:val="16"/>
+          <w:szCs w:val="16"/>
+        </w:rPr>
+        <w:t>[SPEC_TABLE_MARKER]</w:t>
+      </w:r>
+    </w:p>
+    <w:p>
+      <w:pPr>
+        <w:pStyle w:val="ListParagraph"/>
+        <w:spacing w:line="276" w:lineRule="auto"/>
         <w:ind w:left="1440"/>
         <w:rPr>
           <w:rFonts w:ascii="Century Gothic" w:hAnsi="Century Gothic" w:cs="Century Gothic"/>
@@ -971,149 +605,13 @@
           <w:szCs w:val="18"/>
         </w:rPr>
       </w:pPr>
-      <w:proofErr w:type="spellStart"/>
-      <w:r>
-        <w:rPr>
-          <w:rFonts w:ascii="Century Gothic" w:hAnsi="Century Gothic" w:cs="Century Gothic"/>
-          <w:sz w:val="18"/>
-          <w:szCs w:val="18"/>
-        </w:rPr>
-        <w:t>Demikianlah</w:t>
-      </w:r>
-      <w:proofErr w:type="spellEnd"/>
-      <w:r>
-        <w:rPr>
-          <w:rFonts w:ascii="Century Gothic" w:hAnsi="Century Gothic" w:cs="Century Gothic"/>
-          <w:sz w:val="18"/>
-          <w:szCs w:val="18"/>
-        </w:rPr>
-        <w:t xml:space="preserve"> </w:t>
-      </w:r>
-      <w:proofErr w:type="spellStart"/>
-      <w:r>
-        <w:rPr>
-          <w:rFonts w:ascii="Century Gothic" w:hAnsi="Century Gothic" w:cs="Century Gothic"/>
-          <w:sz w:val="18"/>
-          <w:szCs w:val="18"/>
-        </w:rPr>
-        <w:t>penawaran</w:t>
-      </w:r>
-      <w:proofErr w:type="spellEnd"/>
-      <w:r>
-        <w:rPr>
-          <w:rFonts w:ascii="Century Gothic" w:hAnsi="Century Gothic" w:cs="Century Gothic"/>
-          <w:sz w:val="18"/>
-          <w:szCs w:val="18"/>
-        </w:rPr>
-        <w:t xml:space="preserve"> </w:t>
-      </w:r>
-      <w:proofErr w:type="spellStart"/>
-      <w:r>
-        <w:rPr>
-          <w:rFonts w:ascii="Century Gothic" w:hAnsi="Century Gothic" w:cs="Century Gothic"/>
-          <w:sz w:val="18"/>
-          <w:szCs w:val="18"/>
-        </w:rPr>
-        <w:t>dari</w:t>
-      </w:r>
-      <w:proofErr w:type="spellEnd"/>
-      <w:r>
-        <w:rPr>
-          <w:rFonts w:ascii="Century Gothic" w:hAnsi="Century Gothic" w:cs="Century Gothic"/>
-          <w:sz w:val="18"/>
-          <w:szCs w:val="18"/>
-        </w:rPr>
-        <w:t xml:space="preserve"> kami, </w:t>
-      </w:r>
-      <w:proofErr w:type="spellStart"/>
-      <w:r>
-        <w:rPr>
-          <w:rFonts w:ascii="Century Gothic" w:hAnsi="Century Gothic" w:cs="Century Gothic"/>
-          <w:sz w:val="18"/>
-          <w:szCs w:val="18"/>
-        </w:rPr>
-        <w:t>atas</w:t>
-      </w:r>
-      <w:proofErr w:type="spellEnd"/>
-      <w:r>
-        <w:rPr>
-          <w:rFonts w:ascii="Century Gothic" w:hAnsi="Century Gothic" w:cs="Century Gothic"/>
-          <w:sz w:val="18"/>
-          <w:szCs w:val="18"/>
-        </w:rPr>
-        <w:t xml:space="preserve"> </w:t>
-      </w:r>
-      <w:proofErr w:type="spellStart"/>
-      <w:r>
-        <w:rPr>
-          <w:rFonts w:ascii="Century Gothic" w:hAnsi="Century Gothic" w:cs="Century Gothic"/>
-          <w:sz w:val="18"/>
-          <w:szCs w:val="18"/>
-        </w:rPr>
-        <w:t>perhatian</w:t>
-      </w:r>
-      <w:proofErr w:type="spellEnd"/>
-      <w:r>
-        <w:rPr>
-          <w:rFonts w:ascii="Century Gothic" w:hAnsi="Century Gothic" w:cs="Century Gothic"/>
-          <w:sz w:val="18"/>
-          <w:szCs w:val="18"/>
-        </w:rPr>
-        <w:t xml:space="preserve"> dan </w:t>
-      </w:r>
-      <w:proofErr w:type="spellStart"/>
-      <w:r>
-        <w:rPr>
-          <w:rFonts w:ascii="Century Gothic" w:hAnsi="Century Gothic" w:cs="Century Gothic"/>
-          <w:sz w:val="18"/>
-          <w:szCs w:val="18"/>
-        </w:rPr>
-        <w:t>kerjasamanya</w:t>
-      </w:r>
-      <w:proofErr w:type="spellEnd"/>
-      <w:r>
-        <w:rPr>
-          <w:rFonts w:ascii="Century Gothic" w:hAnsi="Century Gothic" w:cs="Century Gothic"/>
-          <w:sz w:val="18"/>
-          <w:szCs w:val="18"/>
-        </w:rPr>
-        <w:t xml:space="preserve"> kami </w:t>
-      </w:r>
-      <w:proofErr w:type="spellStart"/>
-      <w:r>
-        <w:rPr>
-          <w:rFonts w:ascii="Century Gothic" w:hAnsi="Century Gothic" w:cs="Century Gothic"/>
-          <w:sz w:val="18"/>
-          <w:szCs w:val="18"/>
-        </w:rPr>
-        <w:t>ucapkan</w:t>
-      </w:r>
-      <w:proofErr w:type="spellEnd"/>
-      <w:r>
-        <w:rPr>
-          <w:rFonts w:ascii="Century Gothic" w:hAnsi="Century Gothic" w:cs="Century Gothic"/>
-          <w:sz w:val="18"/>
-          <w:szCs w:val="18"/>
-        </w:rPr>
-        <w:t xml:space="preserve"> </w:t>
-      </w:r>
-      <w:proofErr w:type="spellStart"/>
-      <w:r>
-        <w:rPr>
-          <w:rFonts w:ascii="Century Gothic" w:hAnsi="Century Gothic" w:cs="Century Gothic"/>
-          <w:sz w:val="18"/>
-          <w:szCs w:val="18"/>
-        </w:rPr>
-        <w:t>terimakasih</w:t>
-      </w:r>
-      <w:proofErr w:type="spellEnd"/>
-      <w:r>
-        <w:rPr>
-          <w:rFonts w:ascii="Century Gothic" w:hAnsi="Century Gothic" w:cs="Century Gothic"/>
-          <w:sz w:val="18"/>
-          <w:szCs w:val="18"/>
-        </w:rPr>
-        <w:t>.</w:t>
+      <w:r>
+        <w:rPr>
+          <w:rFonts w:ascii="Century Gothic" w:hAnsi="Century Gothic" w:cs="Century Gothic"/>
+          <w:sz w:val="18"/>
+          <w:szCs w:val="18"/>
+        </w:rPr>
+        <w:t>Demikianlah penawaran dari kami, atas perhatian dan kerjasamanya kami ucapkan terimakasih.</w:t>
       </w:r>
     </w:p>
     <w:p>
@@ -1162,39 +660,8 @@
           <w:sz w:val="18"/>
           <w:szCs w:val="16"/>
         </w:rPr>
-        <w:t xml:space="preserve">PT. </w:t>
-      </w:r>
-      <w:proofErr w:type="spellStart"/>
-      <w:r>
-        <w:rPr>
-          <w:rFonts w:ascii="Century Gothic" w:hAnsi="Century Gothic" w:cs="Century Gothic"/>
-          <w:b/>
-          <w:sz w:val="18"/>
-          <w:szCs w:val="16"/>
-        </w:rPr>
-        <w:t>Sukses</w:t>
-      </w:r>
-      <w:proofErr w:type="spellEnd"/>
-      <w:r>
-        <w:rPr>
-          <w:rFonts w:ascii="Century Gothic" w:hAnsi="Century Gothic" w:cs="Century Gothic"/>
-          <w:b/>
-          <w:sz w:val="18"/>
-          <w:szCs w:val="16"/>
-        </w:rPr>
-        <w:t xml:space="preserve"> Tunggal </w:t>
-      </w:r>
-      <w:proofErr w:type="spellStart"/>
-      <w:r>
-        <w:rPr>
-          <w:rFonts w:ascii="Century Gothic" w:hAnsi="Century Gothic" w:cs="Century Gothic"/>
-          <w:b/>
-          <w:sz w:val="18"/>
-          <w:szCs w:val="16"/>
-        </w:rPr>
-        <w:t>Mandiri</w:t>
-      </w:r>
-      <w:proofErr w:type="spellEnd"/>
+        <w:t>PT. Sukses Tunggal Mandiri</w:t>
+      </w:r>
       <w:r>
         <w:rPr>
           <w:rFonts w:ascii="Century Gothic" w:hAnsi="Century Gothic" w:cs="Century Gothic"/>
@@ -1377,7 +844,6 @@
           <w:szCs w:val="16"/>
         </w:rPr>
       </w:pPr>
-      <w:proofErr w:type="spellStart"/>
       <w:r>
         <w:rPr>
           <w:rFonts w:ascii="Century Gothic" w:hAnsi="Century Gothic" w:cs="Tahoma"/>
@@ -1389,46 +855,25 @@
         </w:rPr>
         <w:t>jabatan</w:t>
       </w:r>
-      <w:proofErr w:type="spellEnd"/>
-    </w:p>
-    <w:p>
-      <w:pPr>
-        <w:spacing w:line="10" w:lineRule="atLeast"/>
-        <w:rPr>
-          <w:rFonts w:ascii="Century Gothic" w:hAnsi="Century Gothic" w:cs="Tahoma"/>
-          <w:color w:val="000000"/>
-          <w:sz w:val="16"/>
-          <w:szCs w:val="16"/>
-        </w:rPr>
-      </w:pPr>
-      <w:r>
-        <w:rPr>
-          <w:rFonts w:ascii="Century Gothic" w:hAnsi="Century Gothic" w:cs="Tahoma"/>
-          <w:color w:val="000000"/>
-          <w:sz w:val="16"/>
-          <w:szCs w:val="16"/>
-        </w:rPr>
-        <w:t>{</w:t>
-      </w:r>
-      <w:proofErr w:type="spellStart"/>
-      <w:r>
-        <w:rPr>
-          <w:rFonts w:ascii="Century Gothic" w:hAnsi="Century Gothic" w:cs="Tahoma"/>
-          <w:color w:val="000000"/>
-          <w:sz w:val="16"/>
-          <w:szCs w:val="16"/>
-        </w:rPr>
-        <w:t>phone_number</w:t>
-      </w:r>
-      <w:proofErr w:type="spellEnd"/>
-      <w:r>
-        <w:rPr>
-          <w:rFonts w:ascii="Century Gothic" w:hAnsi="Century Gothic" w:cs="Tahoma"/>
-          <w:color w:val="000000"/>
-          <w:sz w:val="16"/>
-          <w:szCs w:val="16"/>
-        </w:rPr>
-        <w:t>}</w:t>
+    </w:p>
+    <w:p>
+      <w:pPr>
+        <w:spacing w:line="10" w:lineRule="atLeast"/>
+        <w:rPr>
+          <w:rFonts w:ascii="Century Gothic" w:hAnsi="Century Gothic" w:cs="Tahoma"/>
+          <w:color w:val="000000"/>
+          <w:sz w:val="16"/>
+          <w:szCs w:val="16"/>
+        </w:rPr>
+      </w:pPr>
+      <w:r>
+        <w:rPr>
+          <w:rFonts w:ascii="Century Gothic" w:hAnsi="Century Gothic" w:cs="Tahoma"/>
+          <w:color w:val="000000"/>
+          <w:sz w:val="16"/>
+          <w:szCs w:val="16"/>
+        </w:rPr>
+        <w:t>{phone_number}</w:t>
       </w:r>
     </w:p>
     <w:p>
@@ -1798,27 +1243,7 @@
           <w:sz w:val="18"/>
           <w:szCs w:val="18"/>
         </w:rPr>
-        <w:t>{%</w:t>
-      </w:r>
-      <w:proofErr w:type="spellStart"/>
-      <w:r>
-        <w:rPr>
-          <w:rFonts w:ascii="Century Gothic" w:hAnsi="Century Gothic" w:cs="Century Gothic"/>
-          <w:color w:val="000000"/>
-          <w:sz w:val="18"/>
-          <w:szCs w:val="18"/>
-        </w:rPr>
-        <w:t>imageTag</w:t>
-      </w:r>
-      <w:proofErr w:type="spellEnd"/>
-      <w:r>
-        <w:rPr>
-          <w:rFonts w:ascii="Century Gothic" w:hAnsi="Century Gothic" w:cs="Century Gothic"/>
-          <w:color w:val="000000"/>
-          <w:sz w:val="18"/>
-          <w:szCs w:val="18"/>
-        </w:rPr>
-        <w:t>}</w:t>
+        <w:t>{%imageTag}</w:t>
       </w:r>
     </w:p>
     <w:p>
@@ -2691,6 +2116,7 @@
   <w:style w:type="character" w:default="1" w:styleId="DefaultParagraphFont">
     <w:name w:val="Default Paragraph Font"/>
     <w:uiPriority w:val="1"/>
+    <w:semiHidden/>
     <w:unhideWhenUsed/>
   </w:style>
   <w:style w:type="table" w:default="1" w:styleId="TableNormal">

</xml_diff>